<commit_message>
Handoff: one-paste cloud-setup.sql + ONBOARDING doc
Co-Authored-By: Claude Fable 5 <noreply@anthropic.com>
</commit_message>
<xml_diff>
--- a/ONBOARDING.docx
+++ b/ONBOARDING.docx
@@ -205,7 +205,7 @@
     <w:p>
       <w:pPr>
         <w:shd w:val="clear" w:color="auto" w:fill="FAF6E9"/>
-        <w:divId w:val="485052512"/>
+        <w:divId w:val="262156740"/>
         <w:rPr>
           <w:rFonts w:ascii="Calibri" w:eastAsia="Times New Roman" w:hAnsi="Calibri" w:cs="Calibri"/>
           <w:color w:val="1A1A1A"/>
@@ -260,7 +260,7 @@
           <w:sz w:val="22"/>
           <w:szCs w:val="22"/>
         </w:rPr>
-        <w:pict w14:anchorId="44FFCD09">
+        <w:pict w14:anchorId="2437C0AC">
           <v:rect id="_x0000_i1025" style="width:0;height:1.5pt" o:hralign="center" o:hrstd="t" o:hr="t" fillcolor="#a0a0a0" stroked="f"/>
         </w:pict>
       </w:r>
@@ -1506,7 +1506,7 @@
           <w:sz w:val="22"/>
           <w:szCs w:val="22"/>
         </w:rPr>
-        <w:pict w14:anchorId="2469AC8F">
+        <w:pict w14:anchorId="09E75144">
           <v:rect id="_x0000_i1026" style="width:0;height:1.5pt" o:hralign="center" o:hrstd="t" o:hr="t" fillcolor="#a0a0a0" stroked="f"/>
         </w:pict>
       </w:r>
@@ -1881,7 +1881,7 @@
           <w:sz w:val="22"/>
           <w:szCs w:val="22"/>
         </w:rPr>
-        <w:pict w14:anchorId="050DBF12">
+        <w:pict w14:anchorId="0A255BD3">
           <v:rect id="_x0000_i1027" style="width:0;height:1.5pt" o:hralign="center" o:hrstd="t" o:hr="t" fillcolor="#a0a0a0" stroked="f"/>
         </w:pict>
       </w:r>
@@ -1897,7 +1897,7 @@
         <w:rPr>
           <w:rFonts w:ascii="Calibri" w:eastAsia="Times New Roman" w:hAnsi="Calibri" w:cs="Calibri"/>
         </w:rPr>
-        <w:t>3. Cloud assets (what you need from George)</w:t>
+        <w:t>3. Cloud assets (all self-service — nothing needed from George)</w:t>
       </w:r>
     </w:p>
     <w:p>
@@ -1911,19 +1911,7 @@
         <w:rPr>
           <w:rFonts w:ascii="Calibri" w:eastAsia="Times New Roman" w:hAnsi="Calibri" w:cs="Calibri"/>
         </w:rPr>
-        <w:t xml:space="preserve">Hosted Supabase (project ref </w:t>
-      </w:r>
-      <w:r>
-        <w:rPr>
-          <w:rStyle w:val="HTMLCode"/>
-        </w:rPr>
-        <w:t>ydhypslunoybvwoslyss</w:t>
-      </w:r>
-      <w:r>
-        <w:rPr>
-          <w:rFonts w:ascii="Calibri" w:eastAsia="Times New Roman" w:hAnsi="Calibri" w:cs="Calibri"/>
-        </w:rPr>
-        <w:t>)</w:t>
+        <w:t>Hosted Supabase — create your own (10 minutes, free tier)</w:t>
       </w:r>
     </w:p>
     <w:p>
@@ -1943,464 +1931,7 @@
           <w:sz w:val="22"/>
           <w:szCs w:val="22"/>
         </w:rPr>
-        <w:t xml:space="preserve">The deployed app points at a hosted Supabase project on George's account. Either get </w:t>
-      </w:r>
-      <w:r>
-        <w:rPr>
-          <w:rFonts w:ascii="Calibri" w:hAnsi="Calibri" w:cs="Calibri"/>
-          <w:b/>
-          <w:bCs/>
-          <w:color w:val="1A1A1A"/>
-          <w:sz w:val="22"/>
-          <w:szCs w:val="22"/>
-        </w:rPr>
-        <w:t>invited to the org / have the project transferred</w:t>
-      </w:r>
-      <w:r>
-        <w:rPr>
-          <w:rFonts w:ascii="Calibri" w:hAnsi="Calibri" w:cs="Calibri"/>
-          <w:color w:val="1A1A1A"/>
-          <w:sz w:val="22"/>
-          <w:szCs w:val="22"/>
-        </w:rPr>
-        <w:t xml:space="preserve"> (Supabase dashboard → Project Settings), or create your own </w:t>
-      </w:r>
-      <w:r>
-        <w:rPr>
-          <w:rFonts w:ascii="Calibri" w:hAnsi="Calibri" w:cs="Calibri"/>
-          <w:color w:val="1A1A1A"/>
-          <w:sz w:val="22"/>
-          <w:szCs w:val="22"/>
-        </w:rPr>
-        <w:lastRenderedPageBreak/>
-        <w:t xml:space="preserve">project and set it up from the repo: run </w:t>
-      </w:r>
-      <w:r>
-        <w:rPr>
-          <w:rStyle w:val="HTMLCode"/>
-          <w:color w:val="1A1A1A"/>
-        </w:rPr>
-        <w:t>supabase/cloud-setup</w:t>
-      </w:r>
-      <w:r>
-        <w:rPr>
-          <w:rStyle w:val="HTMLCode"/>
-          <w:color w:val="1A1A1A"/>
-        </w:rPr>
-        <w:t>.sql</w:t>
-      </w:r>
-      <w:r>
-        <w:rPr>
-          <w:rFonts w:ascii="Calibri" w:hAnsi="Calibri" w:cs="Calibri"/>
-          <w:color w:val="1A1A1A"/>
-          <w:sz w:val="22"/>
-          <w:szCs w:val="22"/>
-        </w:rPr>
-        <w:t xml:space="preserve"> in the SQL editor, then any </w:t>
-      </w:r>
-      <w:r>
-        <w:rPr>
-          <w:rStyle w:val="HTMLCode"/>
-          <w:color w:val="1A1A1A"/>
-        </w:rPr>
-        <w:t>supabase/cloud-update-*.sql</w:t>
-      </w:r>
-      <w:r>
-        <w:rPr>
-          <w:rFonts w:ascii="Calibri" w:hAnsi="Calibri" w:cs="Calibri"/>
-          <w:color w:val="1A1A1A"/>
-          <w:sz w:val="22"/>
-          <w:szCs w:val="22"/>
-        </w:rPr>
-        <w:t xml:space="preserve"> scripts newer than it, then create the demo logins:</w:t>
-      </w:r>
-    </w:p>
-    <w:p>
-      <w:pPr>
-        <w:pStyle w:val="HTMLPreformatted"/>
-        <w:rPr>
-          <w:color w:val="1A1A1A"/>
-        </w:rPr>
-      </w:pPr>
-      <w:r>
-        <w:rPr>
-          <w:color w:val="1A1A1A"/>
-        </w:rPr>
-        <w:t>$env:SUPABASE_URL = "https://&lt;your-ref&gt;.supabase.co"</w:t>
-      </w:r>
-    </w:p>
-    <w:p>
-      <w:pPr>
-        <w:pStyle w:val="HTMLPreformatted"/>
-        <w:rPr>
-          <w:color w:val="1A1A1A"/>
-        </w:rPr>
-      </w:pPr>
-      <w:r>
-        <w:rPr>
-          <w:color w:val="1A1A1A"/>
-        </w:rPr>
-        <w:t>$env:SUPABASE_SERVICE_ROLE_KEY = "&lt;service role key from dashboard&gt;"</w:t>
-      </w:r>
-    </w:p>
-    <w:p>
-      <w:pPr>
-        <w:pStyle w:val="HTMLPreformatted"/>
-        <w:rPr>
-          <w:color w:val="1A1A1A"/>
-        </w:rPr>
-      </w:pPr>
-      <w:r>
-        <w:rPr>
-          <w:color w:val="1A1A1A"/>
-        </w:rPr>
-        <w:t>node scripts/seed-aut</w:t>
-      </w:r>
-      <w:r>
-        <w:rPr>
-          <w:color w:val="1A1A1A"/>
-        </w:rPr>
-        <w:t>h.mjs</w:t>
-      </w:r>
-    </w:p>
-    <w:p>
-      <w:pPr>
-        <w:pStyle w:val="warn"/>
-        <w:spacing w:after="100" w:afterAutospacing="1"/>
-        <w:rPr>
-          <w:rFonts w:ascii="Calibri" w:hAnsi="Calibri" w:cs="Calibri"/>
-          <w:color w:val="1A1A1A"/>
-          <w:sz w:val="22"/>
-          <w:szCs w:val="22"/>
-        </w:rPr>
-      </w:pPr>
-      <w:r>
-        <w:rPr>
-          <w:rFonts w:ascii="Segoe UI Emoji" w:hAnsi="Segoe UI Emoji" w:cs="Segoe UI Emoji"/>
-          <w:color w:val="1A1A1A"/>
-          <w:sz w:val="22"/>
-          <w:szCs w:val="22"/>
-        </w:rPr>
-        <w:t>⚠</w:t>
-      </w:r>
-      <w:r>
-        <w:rPr>
-          <w:rFonts w:ascii="Calibri" w:hAnsi="Calibri" w:cs="Calibri"/>
-          <w:color w:val="1A1A1A"/>
-          <w:sz w:val="22"/>
-          <w:szCs w:val="22"/>
-        </w:rPr>
-        <w:t>️</w:t>
-      </w:r>
-      <w:r>
-        <w:rPr>
-          <w:rFonts w:ascii="Calibri" w:hAnsi="Calibri" w:cs="Calibri"/>
-          <w:color w:val="1A1A1A"/>
-          <w:sz w:val="22"/>
-          <w:szCs w:val="22"/>
-        </w:rPr>
-        <w:t xml:space="preserve"> If you inherit the existing project, check the </w:t>
-      </w:r>
-      <w:r>
-        <w:rPr>
-          <w:rStyle w:val="HTMLCode"/>
-          <w:color w:val="1A1A1A"/>
-        </w:rPr>
-        <w:t>cloud-update-*.sql</w:t>
-      </w:r>
-      <w:r>
-        <w:rPr>
-          <w:rFonts w:ascii="Calibri" w:hAnsi="Calibri" w:cs="Calibri"/>
-          <w:color w:val="1A1A1A"/>
-          <w:sz w:val="22"/>
-          <w:szCs w:val="22"/>
-        </w:rPr>
-        <w:t xml:space="preserve"> scripts have all been applied — at the time of writing at least </w:t>
-      </w:r>
-      <w:r>
-        <w:rPr>
-          <w:rStyle w:val="HTMLCode"/>
-          <w:color w:val="1A1A1A"/>
-        </w:rPr>
-        <w:t>cloud-update-sites.sql</w:t>
-      </w:r>
-      <w:r>
-        <w:rPr>
-          <w:rFonts w:ascii="Calibri" w:hAnsi="Calibri" w:cs="Calibri"/>
-          <w:color w:val="1A1A1A"/>
-          <w:sz w:val="22"/>
-          <w:szCs w:val="22"/>
-        </w:rPr>
-        <w:t xml:space="preserve"> and </w:t>
-      </w:r>
-      <w:r>
-        <w:rPr>
-          <w:rStyle w:val="HTMLCode"/>
-          <w:color w:val="1A1A1A"/>
-        </w:rPr>
-        <w:t>cloud-update-hardening.sql</w:t>
-      </w:r>
-      <w:r>
-        <w:rPr>
-          <w:rFonts w:ascii="Calibri" w:hAnsi="Calibri" w:cs="Calibri"/>
-          <w:color w:val="1A1A1A"/>
-          <w:sz w:val="22"/>
-          <w:szCs w:val="22"/>
-        </w:rPr>
-        <w:t xml:space="preserve"> were outstanding.</w:t>
-      </w:r>
-    </w:p>
-    <w:p>
-      <w:pPr>
-        <w:pStyle w:val="NormalWeb"/>
-        <w:rPr>
-          <w:rFonts w:ascii="Calibri" w:hAnsi="Calibri" w:cs="Calibri"/>
-          <w:color w:val="1A1A1A"/>
-          <w:sz w:val="22"/>
-          <w:szCs w:val="22"/>
-        </w:rPr>
-      </w:pPr>
-      <w:r>
-        <w:rPr>
-          <w:rFonts w:ascii="Calibri" w:hAnsi="Calibri" w:cs="Calibri"/>
-          <w:color w:val="1A1A1A"/>
-          <w:sz w:val="22"/>
-          <w:szCs w:val="22"/>
-        </w:rPr>
-        <w:t xml:space="preserve">The </w:t>
-      </w:r>
-      <w:r>
-        <w:rPr>
-          <w:rFonts w:ascii="Calibri" w:hAnsi="Calibri" w:cs="Calibri"/>
-          <w:b/>
-          <w:bCs/>
-          <w:color w:val="1A1A1A"/>
-          <w:sz w:val="22"/>
-          <w:szCs w:val="22"/>
-        </w:rPr>
-        <w:t>service-role key</w:t>
-      </w:r>
-      <w:r>
-        <w:rPr>
-          <w:rFonts w:ascii="Calibri" w:hAnsi="Calibri" w:cs="Calibri"/>
-          <w:color w:val="1A1A1A"/>
-          <w:sz w:val="22"/>
-          <w:szCs w:val="22"/>
-        </w:rPr>
-        <w:t xml:space="preserve"> </w:t>
-      </w:r>
-      <w:r>
-        <w:rPr>
-          <w:rFonts w:ascii="Calibri" w:hAnsi="Calibri" w:cs="Calibri"/>
-          <w:color w:val="1A1A1A"/>
-          <w:sz w:val="22"/>
-          <w:szCs w:val="22"/>
-        </w:rPr>
-        <w:t xml:space="preserve">(dashboard → Settings → API) is the only real secret in this project. It never goes in git or in </w:t>
-      </w:r>
-      <w:r>
-        <w:rPr>
-          <w:rStyle w:val="HTMLCode"/>
-          <w:color w:val="1A1A1A"/>
-        </w:rPr>
-        <w:t>.env</w:t>
-      </w:r>
-      <w:r>
-        <w:rPr>
-          <w:rFonts w:ascii="Calibri" w:hAnsi="Calibri" w:cs="Calibri"/>
-          <w:color w:val="1A1A1A"/>
-          <w:sz w:val="22"/>
-          <w:szCs w:val="22"/>
-        </w:rPr>
-        <w:t xml:space="preserve"> committed anywhere.</w:t>
-      </w:r>
-    </w:p>
-    <w:p>
-      <w:pPr>
-        <w:pStyle w:val="Heading3"/>
-        <w:rPr>
-          <w:rFonts w:ascii="Calibri" w:eastAsia="Times New Roman" w:hAnsi="Calibri" w:cs="Calibri"/>
-        </w:rPr>
-      </w:pPr>
-      <w:r>
-        <w:rPr>
-          <w:rFonts w:ascii="Calibri" w:eastAsia="Times New Roman" w:hAnsi="Calibri" w:cs="Calibri"/>
-        </w:rPr>
-        <w:t>Vercel</w:t>
-      </w:r>
-    </w:p>
-    <w:p>
-      <w:pPr>
-        <w:pStyle w:val="NormalWeb"/>
-        <w:rPr>
-          <w:rFonts w:ascii="Calibri" w:hAnsi="Calibri" w:cs="Calibri"/>
-          <w:color w:val="1A1A1A"/>
-          <w:sz w:val="22"/>
-          <w:szCs w:val="22"/>
-        </w:rPr>
-      </w:pPr>
-      <w:r>
-        <w:rPr>
-          <w:rFonts w:ascii="Calibri" w:hAnsi="Calibri" w:cs="Calibri"/>
-          <w:color w:val="1A1A1A"/>
-          <w:sz w:val="22"/>
-          <w:szCs w:val="22"/>
-        </w:rPr>
-        <w:t xml:space="preserve">The current Vercel project is </w:t>
-      </w:r>
-      <w:r>
-        <w:rPr>
-          <w:rFonts w:ascii="Calibri" w:hAnsi="Calibri" w:cs="Calibri"/>
-          <w:b/>
-          <w:bCs/>
-          <w:color w:val="1A1A1A"/>
-          <w:sz w:val="22"/>
-          <w:szCs w:val="22"/>
-        </w:rPr>
-        <w:t>not git-connected</w:t>
-      </w:r>
-      <w:r>
-        <w:rPr>
-          <w:rFonts w:ascii="Calibri" w:hAnsi="Calibri" w:cs="Calibri"/>
-          <w:color w:val="1A1A1A"/>
-          <w:sz w:val="22"/>
-          <w:szCs w:val="22"/>
-        </w:rPr>
-        <w:t xml:space="preserve"> — deploys were manual via </w:t>
-      </w:r>
-      <w:r>
-        <w:rPr>
-          <w:rStyle w:val="HTMLCode"/>
-          <w:color w:val="1A1A1A"/>
-        </w:rPr>
-        <w:t>npx vercel --prod</w:t>
-      </w:r>
-      <w:r>
-        <w:rPr>
-          <w:rFonts w:ascii="Calibri" w:hAnsi="Calibri" w:cs="Calibri"/>
-          <w:color w:val="1A1A1A"/>
-          <w:sz w:val="22"/>
-          <w:szCs w:val="22"/>
-        </w:rPr>
-        <w:t>. Recommended: import the GitHub rep</w:t>
-      </w:r>
-      <w:r>
-        <w:rPr>
-          <w:rFonts w:ascii="Calibri" w:hAnsi="Calibri" w:cs="Calibri"/>
-          <w:color w:val="1A1A1A"/>
-          <w:sz w:val="22"/>
-          <w:szCs w:val="22"/>
-        </w:rPr>
-        <w:t>o into your own Vercel account (New Project → Import), set two environment variables:</w:t>
-      </w:r>
-    </w:p>
-    <w:p>
-      <w:pPr>
-        <w:pStyle w:val="HTMLPreformatted"/>
-        <w:rPr>
-          <w:color w:val="1A1A1A"/>
-        </w:rPr>
-      </w:pPr>
-      <w:r>
-        <w:rPr>
-          <w:color w:val="1A1A1A"/>
-        </w:rPr>
-        <w:t>VITE_SUPABASE_URL       = https://&lt;ref&gt;.supabase.co</w:t>
-      </w:r>
-    </w:p>
-    <w:p>
-      <w:pPr>
-        <w:pStyle w:val="HTMLPreformatted"/>
-        <w:rPr>
-          <w:color w:val="1A1A1A"/>
-        </w:rPr>
-      </w:pPr>
-      <w:r>
-        <w:rPr>
-          <w:color w:val="1A1A1A"/>
-        </w:rPr>
-        <w:t>VITE_SUPABASE_ANON_KEY  = &lt;anon/publishable key from the Supabase dashboard&gt;</w:t>
-      </w:r>
-    </w:p>
-    <w:p>
-      <w:pPr>
-        <w:pStyle w:val="NormalWeb"/>
-        <w:rPr>
-          <w:rFonts w:ascii="Calibri" w:hAnsi="Calibri" w:cs="Calibri"/>
-          <w:color w:val="1A1A1A"/>
-          <w:sz w:val="22"/>
-          <w:szCs w:val="22"/>
-        </w:rPr>
-      </w:pPr>
-      <w:r>
-        <w:rPr>
-          <w:rFonts w:ascii="Calibri" w:hAnsi="Calibri" w:cs="Calibri"/>
-          <w:color w:val="1A1A1A"/>
-          <w:sz w:val="22"/>
-          <w:szCs w:val="22"/>
-        </w:rPr>
-        <w:t xml:space="preserve">…and every push to </w:t>
-      </w:r>
-      <w:r>
-        <w:rPr>
-          <w:rStyle w:val="HTMLCode"/>
-          <w:color w:val="1A1A1A"/>
-        </w:rPr>
-        <w:t>master</w:t>
-      </w:r>
-      <w:r>
-        <w:rPr>
-          <w:rFonts w:ascii="Calibri" w:hAnsi="Calibri" w:cs="Calibri"/>
-          <w:color w:val="1A1A1A"/>
-          <w:sz w:val="22"/>
-          <w:szCs w:val="22"/>
-        </w:rPr>
-        <w:t xml:space="preserve"> will auto-deplo</w:t>
-      </w:r>
-      <w:r>
-        <w:rPr>
-          <w:rFonts w:ascii="Calibri" w:hAnsi="Calibri" w:cs="Calibri"/>
-          <w:color w:val="1A1A1A"/>
-          <w:sz w:val="22"/>
-          <w:szCs w:val="22"/>
-        </w:rPr>
-        <w:t>y. (The anon key is publishable — it's safe in a browser bundle; RLS is what protects the data.)</w:t>
-      </w:r>
-    </w:p>
-    <w:p>
-      <w:pPr>
-        <w:spacing w:before="330" w:after="330"/>
-        <w:rPr>
-          <w:rFonts w:ascii="Calibri" w:eastAsia="Times New Roman" w:hAnsi="Calibri" w:cs="Calibri"/>
-          <w:color w:val="1A1A1A"/>
-          <w:sz w:val="22"/>
-          <w:szCs w:val="22"/>
-        </w:rPr>
-      </w:pPr>
-      <w:r>
-        <w:rPr>
-          <w:rFonts w:ascii="Calibri" w:eastAsia="Times New Roman" w:hAnsi="Calibri" w:cs="Calibri"/>
-          <w:color w:val="1A1A1A"/>
-          <w:sz w:val="22"/>
-          <w:szCs w:val="22"/>
-        </w:rPr>
-        <w:pict w14:anchorId="7B67D633">
-          <v:rect id="_x0000_i1028" style="width:0;height:1.5pt" o:hralign="center" o:hrstd="t" o:hr="t" fillcolor="#a0a0a0" stroked="f"/>
-        </w:pict>
-      </w:r>
-    </w:p>
-    <w:p>
-      <w:pPr>
-        <w:pStyle w:val="Heading2"/>
-        <w:rPr>
-          <w:rFonts w:ascii="Calibri" w:eastAsia="Times New Roman" w:hAnsi="Calibri" w:cs="Calibri"/>
-        </w:rPr>
-      </w:pPr>
-      <w:r>
-        <w:rPr>
-          <w:rFonts w:ascii="Calibri" w:eastAsia="Times New Roman" w:hAnsi="Calibri" w:cs="Calibri"/>
-        </w:rPr>
-        <w:t>4. Gotchas that will bite you (learned the hard way)</w:t>
+        <w:t>George's hosted project can't be shared (team members are a paid Supabase feature), and the data in it is throwaway demo seed anyway — so you create your own:</w:t>
       </w:r>
     </w:p>
     <w:p>
@@ -2420,22 +1951,61 @@
       <w:r>
         <w:rPr>
           <w:rFonts w:ascii="Calibri" w:eastAsia="Times New Roman" w:hAnsi="Calibri" w:cs="Calibri"/>
+          <w:color w:val="1A1A1A"/>
+          <w:sz w:val="22"/>
+          <w:szCs w:val="22"/>
+        </w:rPr>
+        <w:lastRenderedPageBreak/>
+        <w:t>supabase.com → New project (free tier i</w:t>
+      </w:r>
+      <w:r>
+        <w:rPr>
+          <w:rFonts w:ascii="Calibri" w:eastAsia="Times New Roman" w:hAnsi="Calibri" w:cs="Calibri"/>
+          <w:color w:val="1A1A1A"/>
+          <w:sz w:val="22"/>
+          <w:szCs w:val="22"/>
+        </w:rPr>
+        <w:t xml:space="preserve">s fine). Note the </w:t>
+      </w:r>
+      <w:r>
+        <w:rPr>
+          <w:rFonts w:ascii="Calibri" w:eastAsia="Times New Roman" w:hAnsi="Calibri" w:cs="Calibri"/>
           <w:b/>
           <w:bCs/>
           <w:color w:val="1A1A1A"/>
           <w:sz w:val="22"/>
           <w:szCs w:val="22"/>
         </w:rPr>
-        <w:t xml:space="preserve">After every </w:t>
-      </w:r>
-      <w:r>
-        <w:rPr>
-          <w:rStyle w:val="HTMLCode"/>
+        <w:t>project URL</w:t>
+      </w:r>
+      <w:r>
+        <w:rPr>
+          <w:rFonts w:ascii="Calibri" w:eastAsia="Times New Roman" w:hAnsi="Calibri" w:cs="Calibri"/>
+          <w:color w:val="1A1A1A"/>
+          <w:sz w:val="22"/>
+          <w:szCs w:val="22"/>
+        </w:rPr>
+        <w:t xml:space="preserve"> and, under Settings → API, the </w:t>
+      </w:r>
+      <w:r>
+        <w:rPr>
+          <w:rFonts w:ascii="Calibri" w:eastAsia="Times New Roman" w:hAnsi="Calibri" w:cs="Calibri"/>
           <w:b/>
           <w:bCs/>
           <w:color w:val="1A1A1A"/>
-        </w:rPr>
-        <w:t>npx supabase db reset</w:t>
+          <w:sz w:val="22"/>
+          <w:szCs w:val="22"/>
+        </w:rPr>
+        <w:t>anon key</w:t>
+      </w:r>
+      <w:r>
+        <w:rPr>
+          <w:rFonts w:ascii="Calibri" w:eastAsia="Times New Roman" w:hAnsi="Calibri" w:cs="Calibri"/>
+          <w:color w:val="1A1A1A"/>
+          <w:sz w:val="22"/>
+          <w:szCs w:val="22"/>
+        </w:rPr>
+        <w:t xml:space="preserve"> and </w:t>
       </w:r>
       <w:r>
         <w:rPr>
@@ -2446,34 +2016,16 @@
           <w:sz w:val="22"/>
           <w:szCs w:val="22"/>
         </w:rPr>
-        <w:t xml:space="preserve">, run </w:t>
-      </w:r>
-      <w:r>
-        <w:rPr>
-          <w:rStyle w:val="HTMLCode"/>
-          <w:b/>
-          <w:bCs/>
-          <w:color w:val="1A1A1A"/>
-        </w:rPr>
-        <w:t>node scripts/seed-auth.mjs</w:t>
-      </w:r>
-      <w:r>
-        <w:rPr>
-          <w:rFonts w:ascii="Calibri" w:eastAsia="Times New Roman" w:hAnsi="Calibri" w:cs="Calibri"/>
-          <w:color w:val="1A1A1A"/>
-          <w:sz w:val="22"/>
-          <w:szCs w:val="22"/>
-        </w:rPr>
-        <w:t xml:space="preserve"> — t</w:t>
-      </w:r>
-      <w:r>
-        <w:rPr>
-          <w:rFonts w:ascii="Calibri" w:eastAsia="Times New Roman" w:hAnsi="Calibri" w:cs="Calibri"/>
-          <w:color w:val="1A1A1A"/>
-          <w:sz w:val="22"/>
-          <w:szCs w:val="22"/>
-        </w:rPr>
-        <w:t>he reset wipes auth users and nobody can log in until you recreate them.</w:t>
+        <w:t>service-role key</w:t>
+      </w:r>
+      <w:r>
+        <w:rPr>
+          <w:rFonts w:ascii="Calibri" w:eastAsia="Times New Roman" w:hAnsi="Calibri" w:cs="Calibri"/>
+          <w:color w:val="1A1A1A"/>
+          <w:sz w:val="22"/>
+          <w:szCs w:val="22"/>
+        </w:rPr>
+        <w:t>.</w:t>
       </w:r>
     </w:p>
     <w:p>
@@ -2493,47 +2045,29 @@
       <w:r>
         <w:rPr>
           <w:rFonts w:ascii="Calibri" w:eastAsia="Times New Roman" w:hAnsi="Calibri" w:cs="Calibri"/>
+          <w:color w:val="1A1A1A"/>
+          <w:sz w:val="22"/>
+          <w:szCs w:val="22"/>
+        </w:rPr>
+        <w:t xml:space="preserve">SQL Editor → paste the whole of </w:t>
+      </w:r>
+      <w:r>
+        <w:rPr>
+          <w:rStyle w:val="HTMLCode"/>
           <w:b/>
           <w:bCs/>
           <w:color w:val="1A1A1A"/>
-          <w:sz w:val="22"/>
-          <w:szCs w:val="22"/>
-        </w:rPr>
-        <w:t>"An invalid response was received from the upstream server"</w:t>
-      </w:r>
-      <w:r>
-        <w:rPr>
-          <w:rFonts w:ascii="Calibri" w:eastAsia="Times New Roman" w:hAnsi="Calibri" w:cs="Calibri"/>
-          <w:color w:val="1A1A1A"/>
-          <w:sz w:val="22"/>
-          <w:szCs w:val="22"/>
-        </w:rPr>
-        <w:t xml:space="preserve"> </w:t>
-      </w:r>
-      <w:r>
-        <w:rPr>
-          <w:rFonts w:ascii="Calibri" w:eastAsia="Times New Roman" w:hAnsi="Calibri" w:cs="Calibri"/>
-          <w:color w:val="1A1A1A"/>
-          <w:sz w:val="22"/>
-          <w:szCs w:val="22"/>
-        </w:rPr>
-        <w:t xml:space="preserve">from storage or auth after a reset → the Kong gateway has stale container routes: </w:t>
-      </w:r>
-      <w:r>
-        <w:rPr>
-          <w:rStyle w:val="HTMLCode"/>
-          <w:color w:val="1A1A1A"/>
-        </w:rPr>
-        <w:t>docker restart supabase_kong_Detrack_PoC</w:t>
-      </w:r>
-      <w:r>
-        <w:rPr>
-          <w:rFonts w:ascii="Calibri" w:eastAsia="Times New Roman" w:hAnsi="Calibri" w:cs="Calibri"/>
-          <w:color w:val="1A1A1A"/>
-          <w:sz w:val="22"/>
-          <w:szCs w:val="22"/>
-        </w:rPr>
-        <w:t>, wait ~5 s, retry.</w:t>
+        </w:rPr>
+        <w:t>supabase/cloud-setup.sql</w:t>
+      </w:r>
+      <w:r>
+        <w:rPr>
+          <w:rFonts w:ascii="Calibri" w:eastAsia="Times New Roman" w:hAnsi="Calibri" w:cs="Calibri"/>
+          <w:color w:val="1A1A1A"/>
+          <w:sz w:val="22"/>
+          <w:szCs w:val="22"/>
+        </w:rPr>
+        <w:t xml:space="preserve"> → Run. It's the complete schema + RLS + storage + demo seed in one script (idempotent — safe to re-run).</w:t>
       </w:r>
     </w:p>
     <w:p>
@@ -2553,68 +2087,322 @@
       <w:r>
         <w:rPr>
           <w:rFonts w:ascii="Calibri" w:eastAsia="Times New Roman" w:hAnsi="Calibri" w:cs="Calibri"/>
+          <w:color w:val="1A1A1A"/>
+          <w:sz w:val="22"/>
+          <w:szCs w:val="22"/>
+        </w:rPr>
+        <w:t>Cr</w:t>
+      </w:r>
+      <w:r>
+        <w:rPr>
+          <w:rFonts w:ascii="Calibri" w:eastAsia="Times New Roman" w:hAnsi="Calibri" w:cs="Calibri"/>
+          <w:color w:val="1A1A1A"/>
+          <w:sz w:val="22"/>
+          <w:szCs w:val="22"/>
+        </w:rPr>
+        <w:t>eate the demo logins:</w:t>
+      </w:r>
+    </w:p>
+    <w:p>
+      <w:pPr>
+        <w:pStyle w:val="HTMLPreformatted"/>
+        <w:rPr>
+          <w:color w:val="1A1A1A"/>
+        </w:rPr>
+      </w:pPr>
+      <w:r>
+        <w:rPr>
+          <w:color w:val="1A1A1A"/>
+        </w:rPr>
+        <w:t>$env:SUPABASE_URL = "https://&lt;your-ref&gt;.supabase.co"</w:t>
+      </w:r>
+    </w:p>
+    <w:p>
+      <w:pPr>
+        <w:pStyle w:val="HTMLPreformatted"/>
+        <w:rPr>
+          <w:color w:val="1A1A1A"/>
+        </w:rPr>
+      </w:pPr>
+      <w:r>
+        <w:rPr>
+          <w:color w:val="1A1A1A"/>
+        </w:rPr>
+        <w:t>$env:SUPABASE_SERVICE_ROLE_KEY = "&lt;service role key from dashboard&gt;"</w:t>
+      </w:r>
+    </w:p>
+    <w:p>
+      <w:pPr>
+        <w:pStyle w:val="HTMLPreformatted"/>
+        <w:rPr>
+          <w:color w:val="1A1A1A"/>
+        </w:rPr>
+      </w:pPr>
+      <w:r>
+        <w:rPr>
+          <w:color w:val="1A1A1A"/>
+        </w:rPr>
+        <w:t>node scripts/seed-auth.mjs</w:t>
+      </w:r>
+    </w:p>
+    <w:p>
+      <w:pPr>
+        <w:pStyle w:val="NormalWeb"/>
+        <w:rPr>
+          <w:rFonts w:ascii="Calibri" w:hAnsi="Calibri" w:cs="Calibri"/>
+          <w:color w:val="1A1A1A"/>
+          <w:sz w:val="22"/>
+          <w:szCs w:val="22"/>
+        </w:rPr>
+      </w:pPr>
+      <w:r>
+        <w:rPr>
+          <w:rFonts w:ascii="Calibri" w:hAnsi="Calibri" w:cs="Calibri"/>
+          <w:color w:val="1A1A1A"/>
+          <w:sz w:val="22"/>
+          <w:szCs w:val="22"/>
+        </w:rPr>
+        <w:t xml:space="preserve">That's a fully working backend. The </w:t>
+      </w:r>
+      <w:r>
+        <w:rPr>
+          <w:rFonts w:ascii="Calibri" w:hAnsi="Calibri" w:cs="Calibri"/>
           <w:b/>
           <w:bCs/>
           <w:color w:val="1A1A1A"/>
           <w:sz w:val="22"/>
           <w:szCs w:val="22"/>
         </w:rPr>
-        <w:t>Sandboxed/restricted shells:</w:t>
-      </w:r>
-      <w:r>
-        <w:rPr>
-          <w:rFonts w:ascii="Calibri" w:eastAsia="Times New Roman" w:hAnsi="Calibri" w:cs="Calibri"/>
-          <w:color w:val="1A1A1A"/>
-          <w:sz w:val="22"/>
-          <w:szCs w:val="22"/>
-        </w:rPr>
-        <w:t xml:space="preserve"> if </w:t>
+        <w:t>service-role key</w:t>
+      </w:r>
+      <w:r>
+        <w:rPr>
+          <w:rFonts w:ascii="Calibri" w:hAnsi="Calibri" w:cs="Calibri"/>
+          <w:color w:val="1A1A1A"/>
+          <w:sz w:val="22"/>
+          <w:szCs w:val="22"/>
+        </w:rPr>
+        <w:t xml:space="preserve"> </w:t>
+      </w:r>
+      <w:r>
+        <w:rPr>
+          <w:rFonts w:ascii="Calibri" w:hAnsi="Calibri" w:cs="Calibri"/>
+          <w:color w:val="1A1A1A"/>
+          <w:sz w:val="22"/>
+          <w:szCs w:val="22"/>
+        </w:rPr>
+        <w:t xml:space="preserve">is the only real secret in this project — it never goes in git or any committed </w:t>
       </w:r>
       <w:r>
         <w:rPr>
           <w:rStyle w:val="HTMLCode"/>
           <w:color w:val="1A1A1A"/>
         </w:rPr>
-        <w:t>npx supabase</w:t>
-      </w:r>
-      <w:r>
-        <w:rPr>
-          <w:rFonts w:ascii="Calibri" w:eastAsia="Times New Roman" w:hAnsi="Calibri" w:cs="Calibri"/>
-          <w:color w:val="1A1A1A"/>
-          <w:sz w:val="22"/>
-          <w:szCs w:val="22"/>
-        </w:rPr>
-        <w:t xml:space="preserve"> fails with EPERM, call the binary directly: </w:t>
+        <w:t>.env</w:t>
+      </w:r>
+      <w:r>
+        <w:rPr>
+          <w:rFonts w:ascii="Calibri" w:hAnsi="Calibri" w:cs="Calibri"/>
+          <w:color w:val="1A1A1A"/>
+          <w:sz w:val="22"/>
+          <w:szCs w:val="22"/>
+        </w:rPr>
+        <w:t>.</w:t>
+      </w:r>
+    </w:p>
+    <w:p>
+      <w:pPr>
+        <w:pStyle w:val="Heading3"/>
+        <w:rPr>
+          <w:rFonts w:ascii="Calibri" w:eastAsia="Times New Roman" w:hAnsi="Calibri" w:cs="Calibri"/>
+        </w:rPr>
+      </w:pPr>
+      <w:r>
+        <w:rPr>
+          <w:rFonts w:ascii="Calibri" w:eastAsia="Times New Roman" w:hAnsi="Calibri" w:cs="Calibri"/>
+        </w:rPr>
+        <w:t>Vercel</w:t>
+      </w:r>
+    </w:p>
+    <w:p>
+      <w:pPr>
+        <w:pStyle w:val="NormalWeb"/>
+        <w:rPr>
+          <w:rFonts w:ascii="Calibri" w:hAnsi="Calibri" w:cs="Calibri"/>
+          <w:color w:val="1A1A1A"/>
+          <w:sz w:val="22"/>
+          <w:szCs w:val="22"/>
+        </w:rPr>
+      </w:pPr>
+      <w:r>
+        <w:rPr>
+          <w:rFonts w:ascii="Calibri" w:hAnsi="Calibri" w:cs="Calibri"/>
+          <w:color w:val="1A1A1A"/>
+          <w:sz w:val="22"/>
+          <w:szCs w:val="22"/>
+        </w:rPr>
+        <w:t xml:space="preserve">The current Vercel project is </w:t>
+      </w:r>
+      <w:r>
+        <w:rPr>
+          <w:rFonts w:ascii="Calibri" w:hAnsi="Calibri" w:cs="Calibri"/>
+          <w:b/>
+          <w:bCs/>
+          <w:color w:val="1A1A1A"/>
+          <w:sz w:val="22"/>
+          <w:szCs w:val="22"/>
+        </w:rPr>
+        <w:t>not git-connected</w:t>
+      </w:r>
+      <w:r>
+        <w:rPr>
+          <w:rFonts w:ascii="Calibri" w:hAnsi="Calibri" w:cs="Calibri"/>
+          <w:color w:val="1A1A1A"/>
+          <w:sz w:val="22"/>
+          <w:szCs w:val="22"/>
+        </w:rPr>
+        <w:t xml:space="preserve"> — deploys were manual via </w:t>
       </w:r>
       <w:r>
         <w:rPr>
           <w:rStyle w:val="HTMLCode"/>
           <w:color w:val="1A1A1A"/>
         </w:rPr>
-        <w:t>node_modules\@supabase\cl</w:t>
+        <w:t>npx vercel --prod</w:t>
+      </w:r>
+      <w:r>
+        <w:rPr>
+          <w:rFonts w:ascii="Calibri" w:hAnsi="Calibri" w:cs="Calibri"/>
+          <w:color w:val="1A1A1A"/>
+          <w:sz w:val="22"/>
+          <w:szCs w:val="22"/>
+        </w:rPr>
+        <w:t xml:space="preserve">. Recommended: import the GitHub repo into your own Vercel account (New </w:t>
+      </w:r>
+      <w:r>
+        <w:rPr>
+          <w:rFonts w:ascii="Calibri" w:hAnsi="Calibri" w:cs="Calibri"/>
+          <w:color w:val="1A1A1A"/>
+          <w:sz w:val="22"/>
+          <w:szCs w:val="22"/>
+        </w:rPr>
+        <w:t>Project → Import), set two environment variables:</w:t>
+      </w:r>
+    </w:p>
+    <w:p>
+      <w:pPr>
+        <w:pStyle w:val="HTMLPreformatted"/>
+        <w:rPr>
+          <w:color w:val="1A1A1A"/>
+        </w:rPr>
+      </w:pPr>
+      <w:r>
+        <w:rPr>
+          <w:color w:val="1A1A1A"/>
+        </w:rPr>
+        <w:t>VITE_SUPABASE_URL       = https://&lt;your-ref&gt;.supabase.co</w:t>
+      </w:r>
+    </w:p>
+    <w:p>
+      <w:pPr>
+        <w:pStyle w:val="HTMLPreformatted"/>
+        <w:rPr>
+          <w:color w:val="1A1A1A"/>
+        </w:rPr>
+      </w:pPr>
+      <w:r>
+        <w:rPr>
+          <w:color w:val="1A1A1A"/>
+        </w:rPr>
+        <w:t>VITE_SUPABASE_ANON_KEY  = &lt;anon key from YOUR Supabase project&gt;</w:t>
+      </w:r>
+    </w:p>
+    <w:p>
+      <w:pPr>
+        <w:pStyle w:val="NormalWeb"/>
+        <w:rPr>
+          <w:rFonts w:ascii="Calibri" w:hAnsi="Calibri" w:cs="Calibri"/>
+          <w:color w:val="1A1A1A"/>
+          <w:sz w:val="22"/>
+          <w:szCs w:val="22"/>
+        </w:rPr>
+      </w:pPr>
+      <w:r>
+        <w:rPr>
+          <w:rFonts w:ascii="Calibri" w:hAnsi="Calibri" w:cs="Calibri"/>
+          <w:color w:val="1A1A1A"/>
+          <w:sz w:val="22"/>
+          <w:szCs w:val="22"/>
+        </w:rPr>
+        <w:t xml:space="preserve">…and every push to </w:t>
       </w:r>
       <w:r>
         <w:rPr>
           <w:rStyle w:val="HTMLCode"/>
           <w:color w:val="1A1A1A"/>
         </w:rPr>
-        <w:t>i-windows-x64\bin\supabase.exe</w:t>
-      </w:r>
-      <w:r>
-        <w:rPr>
-          <w:rFonts w:ascii="Calibri" w:eastAsia="Times New Roman" w:hAnsi="Calibri" w:cs="Calibri"/>
-          <w:color w:val="1A1A1A"/>
-          <w:sz w:val="22"/>
-          <w:szCs w:val="22"/>
-        </w:rPr>
-        <w:t>.</w:t>
+        <w:t>master</w:t>
+      </w:r>
+      <w:r>
+        <w:rPr>
+          <w:rFonts w:ascii="Calibri" w:hAnsi="Calibri" w:cs="Calibri"/>
+          <w:color w:val="1A1A1A"/>
+          <w:sz w:val="22"/>
+          <w:szCs w:val="22"/>
+        </w:rPr>
+        <w:t xml:space="preserve"> will auto-deploy. (The anon key is publishable — it's safe </w:t>
+      </w:r>
+      <w:r>
+        <w:rPr>
+          <w:rFonts w:ascii="Calibri" w:hAnsi="Calibri" w:cs="Calibri"/>
+          <w:color w:val="1A1A1A"/>
+          <w:sz w:val="22"/>
+          <w:szCs w:val="22"/>
+        </w:rPr>
+        <w:t>in a browser bundle; RLS is what protects the data.)</w:t>
+      </w:r>
+    </w:p>
+    <w:p>
+      <w:pPr>
+        <w:spacing w:before="330" w:after="330"/>
+        <w:rPr>
+          <w:rFonts w:ascii="Calibri" w:eastAsia="Times New Roman" w:hAnsi="Calibri" w:cs="Calibri"/>
+          <w:color w:val="1A1A1A"/>
+          <w:sz w:val="22"/>
+          <w:szCs w:val="22"/>
+        </w:rPr>
+      </w:pPr>
+      <w:r>
+        <w:rPr>
+          <w:rFonts w:ascii="Calibri" w:eastAsia="Times New Roman" w:hAnsi="Calibri" w:cs="Calibri"/>
+          <w:color w:val="1A1A1A"/>
+          <w:sz w:val="22"/>
+          <w:szCs w:val="22"/>
+        </w:rPr>
+        <w:pict w14:anchorId="56405104">
+          <v:rect id="_x0000_i1028" style="width:0;height:1.5pt" o:hralign="center" o:hrstd="t" o:hr="t" fillcolor="#a0a0a0" stroked="f"/>
+        </w:pict>
+      </w:r>
+    </w:p>
+    <w:p>
+      <w:pPr>
+        <w:pStyle w:val="Heading2"/>
+        <w:rPr>
+          <w:rFonts w:ascii="Calibri" w:eastAsia="Times New Roman" w:hAnsi="Calibri" w:cs="Calibri"/>
+        </w:rPr>
+      </w:pPr>
+      <w:r>
+        <w:rPr>
+          <w:rFonts w:ascii="Calibri" w:eastAsia="Times New Roman" w:hAnsi="Calibri" w:cs="Calibri"/>
+        </w:rPr>
+        <w:t>4. Gotchas that will bite you (learned the hard way)</w:t>
       </w:r>
     </w:p>
     <w:p>
       <w:pPr>
         <w:numPr>
           <w:ilvl w:val="0"/>
-          <w:numId w:val="4"/>
+          <w:numId w:val="5"/>
         </w:numPr>
         <w:spacing w:before="100" w:beforeAutospacing="1" w:after="60"/>
         <w:rPr>
@@ -2633,48 +2421,61 @@
           <w:sz w:val="22"/>
           <w:szCs w:val="22"/>
         </w:rPr>
-        <w:t>PWA caching:</w:t>
-      </w:r>
-      <w:r>
-        <w:rPr>
-          <w:rFonts w:ascii="Calibri" w:eastAsia="Times New Roman" w:hAnsi="Calibri" w:cs="Calibri"/>
-          <w:color w:val="1A1A1A"/>
-          <w:sz w:val="22"/>
-          <w:szCs w:val="22"/>
-        </w:rPr>
-        <w:t xml:space="preserve"> the app is a service-worker PWA. If a screen looks stale after pulling changes, hard-refresh (Ctrl+Shift+R); after a </w:t>
+        <w:t xml:space="preserve">After every </w:t>
       </w:r>
       <w:r>
         <w:rPr>
           <w:rStyle w:val="HTMLCode"/>
-          <w:color w:val="1A1A1A"/>
-        </w:rPr>
-        <w:t>db reset</w:t>
-      </w:r>
-      <w:r>
-        <w:rPr>
-          <w:rFonts w:ascii="Calibri" w:eastAsia="Times New Roman" w:hAnsi="Calibri" w:cs="Calibri"/>
-          <w:color w:val="1A1A1A"/>
-          <w:sz w:val="22"/>
-          <w:szCs w:val="22"/>
-        </w:rPr>
-        <w:t>, also clear site data (DevTools → Application → Storage) so the offline queue doesn't</w:t>
-      </w:r>
-      <w:r>
-        <w:rPr>
-          <w:rFonts w:ascii="Calibri" w:eastAsia="Times New Roman" w:hAnsi="Calibri" w:cs="Calibri"/>
-          <w:color w:val="1A1A1A"/>
-          <w:sz w:val="22"/>
-          <w:szCs w:val="22"/>
-        </w:rPr>
-        <w:t xml:space="preserve"> hold PODs for wiped parcels.</w:t>
+          <w:b/>
+          <w:bCs/>
+          <w:color w:val="1A1A1A"/>
+        </w:rPr>
+        <w:t>npx supabase db reset</w:t>
+      </w:r>
+      <w:r>
+        <w:rPr>
+          <w:rFonts w:ascii="Calibri" w:eastAsia="Times New Roman" w:hAnsi="Calibri" w:cs="Calibri"/>
+          <w:b/>
+          <w:bCs/>
+          <w:color w:val="1A1A1A"/>
+          <w:sz w:val="22"/>
+          <w:szCs w:val="22"/>
+        </w:rPr>
+        <w:t xml:space="preserve">, run </w:t>
+      </w:r>
+      <w:r>
+        <w:rPr>
+          <w:rStyle w:val="HTMLCode"/>
+          <w:b/>
+          <w:bCs/>
+          <w:color w:val="1A1A1A"/>
+        </w:rPr>
+        <w:t>node scripts/seed-auth.mjs</w:t>
+      </w:r>
+      <w:r>
+        <w:rPr>
+          <w:rFonts w:ascii="Calibri" w:eastAsia="Times New Roman" w:hAnsi="Calibri" w:cs="Calibri"/>
+          <w:color w:val="1A1A1A"/>
+          <w:sz w:val="22"/>
+          <w:szCs w:val="22"/>
+        </w:rPr>
+        <w:t xml:space="preserve"> — the reset wipes auth users and nobody can log</w:t>
+      </w:r>
+      <w:r>
+        <w:rPr>
+          <w:rFonts w:ascii="Calibri" w:eastAsia="Times New Roman" w:hAnsi="Calibri" w:cs="Calibri"/>
+          <w:color w:val="1A1A1A"/>
+          <w:sz w:val="22"/>
+          <w:szCs w:val="22"/>
+        </w:rPr>
+        <w:t xml:space="preserve"> in until you recreate them.</w:t>
       </w:r>
     </w:p>
     <w:p>
       <w:pPr>
         <w:numPr>
           <w:ilvl w:val="0"/>
-          <w:numId w:val="4"/>
+          <w:numId w:val="5"/>
         </w:numPr>
         <w:spacing w:before="100" w:beforeAutospacing="1" w:after="60"/>
         <w:rPr>
@@ -2693,39 +2494,39 @@
           <w:sz w:val="22"/>
           <w:szCs w:val="22"/>
         </w:rPr>
-        <w:t>Real GPS needs a secure context.</w:t>
-      </w:r>
-      <w:r>
-        <w:rPr>
-          <w:rFonts w:ascii="Calibri" w:eastAsia="Times New Roman" w:hAnsi="Calibri" w:cs="Calibri"/>
-          <w:color w:val="1A1A1A"/>
-          <w:sz w:val="22"/>
-          <w:szCs w:val="22"/>
-        </w:rPr>
-        <w:t xml:space="preserve"> On a LAN phone use </w:t>
+        <w:t>"An invalid response was received from the upstream server"</w:t>
+      </w:r>
+      <w:r>
+        <w:rPr>
+          <w:rFonts w:ascii="Calibri" w:eastAsia="Times New Roman" w:hAnsi="Calibri" w:cs="Calibri"/>
+          <w:color w:val="1A1A1A"/>
+          <w:sz w:val="22"/>
+          <w:szCs w:val="22"/>
+        </w:rPr>
+        <w:t xml:space="preserve"> from storage or auth after a reset → the Kong gateway has stale container routes: </w:t>
       </w:r>
       <w:r>
         <w:rPr>
           <w:rStyle w:val="HTMLCode"/>
           <w:color w:val="1A1A1A"/>
         </w:rPr>
-        <w:t>npm run dev:https</w:t>
-      </w:r>
-      <w:r>
-        <w:rPr>
-          <w:rFonts w:ascii="Calibri" w:eastAsia="Times New Roman" w:hAnsi="Calibri" w:cs="Calibri"/>
-          <w:color w:val="1A1A1A"/>
-          <w:sz w:val="22"/>
-          <w:szCs w:val="22"/>
-        </w:rPr>
-        <w:t>, but Chrome auto-denies geolocation on self-signed certs — phone GPS demos really want the deployed (HTTPS) build.</w:t>
+        <w:t>docker restart supabase_kong_Detrack_PoC</w:t>
+      </w:r>
+      <w:r>
+        <w:rPr>
+          <w:rFonts w:ascii="Calibri" w:eastAsia="Times New Roman" w:hAnsi="Calibri" w:cs="Calibri"/>
+          <w:color w:val="1A1A1A"/>
+          <w:sz w:val="22"/>
+          <w:szCs w:val="22"/>
+        </w:rPr>
+        <w:t>, wait ~5 s, retry.</w:t>
       </w:r>
     </w:p>
     <w:p>
       <w:pPr>
         <w:numPr>
           <w:ilvl w:val="0"/>
-          <w:numId w:val="4"/>
+          <w:numId w:val="5"/>
         </w:numPr>
         <w:spacing w:before="100" w:beforeAutospacing="1" w:after="60"/>
         <w:rPr>
@@ -2744,6 +2545,206 @@
           <w:sz w:val="22"/>
           <w:szCs w:val="22"/>
         </w:rPr>
+        <w:t>Sandboxed/restricted shel</w:t>
+      </w:r>
+      <w:r>
+        <w:rPr>
+          <w:rFonts w:ascii="Calibri" w:eastAsia="Times New Roman" w:hAnsi="Calibri" w:cs="Calibri"/>
+          <w:b/>
+          <w:bCs/>
+          <w:color w:val="1A1A1A"/>
+          <w:sz w:val="22"/>
+          <w:szCs w:val="22"/>
+        </w:rPr>
+        <w:t>ls:</w:t>
+      </w:r>
+      <w:r>
+        <w:rPr>
+          <w:rFonts w:ascii="Calibri" w:eastAsia="Times New Roman" w:hAnsi="Calibri" w:cs="Calibri"/>
+          <w:color w:val="1A1A1A"/>
+          <w:sz w:val="22"/>
+          <w:szCs w:val="22"/>
+        </w:rPr>
+        <w:t xml:space="preserve"> if </w:t>
+      </w:r>
+      <w:r>
+        <w:rPr>
+          <w:rStyle w:val="HTMLCode"/>
+          <w:color w:val="1A1A1A"/>
+        </w:rPr>
+        <w:t>npx supabase</w:t>
+      </w:r>
+      <w:r>
+        <w:rPr>
+          <w:rFonts w:ascii="Calibri" w:eastAsia="Times New Roman" w:hAnsi="Calibri" w:cs="Calibri"/>
+          <w:color w:val="1A1A1A"/>
+          <w:sz w:val="22"/>
+          <w:szCs w:val="22"/>
+        </w:rPr>
+        <w:t xml:space="preserve"> fails with EPERM, call the binary directly: </w:t>
+      </w:r>
+      <w:r>
+        <w:rPr>
+          <w:rStyle w:val="HTMLCode"/>
+          <w:color w:val="1A1A1A"/>
+        </w:rPr>
+        <w:t>node_modules\@supabase\cli-windows-x64\bin\supabase.exe</w:t>
+      </w:r>
+      <w:r>
+        <w:rPr>
+          <w:rFonts w:ascii="Calibri" w:eastAsia="Times New Roman" w:hAnsi="Calibri" w:cs="Calibri"/>
+          <w:color w:val="1A1A1A"/>
+          <w:sz w:val="22"/>
+          <w:szCs w:val="22"/>
+        </w:rPr>
+        <w:t>.</w:t>
+      </w:r>
+    </w:p>
+    <w:p>
+      <w:pPr>
+        <w:numPr>
+          <w:ilvl w:val="0"/>
+          <w:numId w:val="5"/>
+        </w:numPr>
+        <w:spacing w:before="100" w:beforeAutospacing="1" w:after="60"/>
+        <w:rPr>
+          <w:rFonts w:ascii="Calibri" w:eastAsia="Times New Roman" w:hAnsi="Calibri" w:cs="Calibri"/>
+          <w:color w:val="1A1A1A"/>
+          <w:sz w:val="22"/>
+          <w:szCs w:val="22"/>
+        </w:rPr>
+      </w:pPr>
+      <w:r>
+        <w:rPr>
+          <w:rFonts w:ascii="Calibri" w:eastAsia="Times New Roman" w:hAnsi="Calibri" w:cs="Calibri"/>
+          <w:b/>
+          <w:bCs/>
+          <w:color w:val="1A1A1A"/>
+          <w:sz w:val="22"/>
+          <w:szCs w:val="22"/>
+        </w:rPr>
+        <w:t>PWA caching:</w:t>
+      </w:r>
+      <w:r>
+        <w:rPr>
+          <w:rFonts w:ascii="Calibri" w:eastAsia="Times New Roman" w:hAnsi="Calibri" w:cs="Calibri"/>
+          <w:color w:val="1A1A1A"/>
+          <w:sz w:val="22"/>
+          <w:szCs w:val="22"/>
+        </w:rPr>
+        <w:t xml:space="preserve"> </w:t>
+      </w:r>
+      <w:r>
+        <w:rPr>
+          <w:rFonts w:ascii="Calibri" w:eastAsia="Times New Roman" w:hAnsi="Calibri" w:cs="Calibri"/>
+          <w:color w:val="1A1A1A"/>
+          <w:sz w:val="22"/>
+          <w:szCs w:val="22"/>
+        </w:rPr>
+        <w:t xml:space="preserve">the app is a service-worker PWA. If a screen looks stale after pulling changes, hard-refresh (Ctrl+Shift+R); after a </w:t>
+      </w:r>
+      <w:r>
+        <w:rPr>
+          <w:rStyle w:val="HTMLCode"/>
+          <w:color w:val="1A1A1A"/>
+        </w:rPr>
+        <w:t>db reset</w:t>
+      </w:r>
+      <w:r>
+        <w:rPr>
+          <w:rFonts w:ascii="Calibri" w:eastAsia="Times New Roman" w:hAnsi="Calibri" w:cs="Calibri"/>
+          <w:color w:val="1A1A1A"/>
+          <w:sz w:val="22"/>
+          <w:szCs w:val="22"/>
+        </w:rPr>
+        <w:t>, also clear site data (DevTools → Application → Storage) so the offline queue doesn't hold PODs for wiped parcels.</w:t>
+      </w:r>
+    </w:p>
+    <w:p>
+      <w:pPr>
+        <w:numPr>
+          <w:ilvl w:val="0"/>
+          <w:numId w:val="5"/>
+        </w:numPr>
+        <w:spacing w:before="100" w:beforeAutospacing="1" w:after="60"/>
+        <w:rPr>
+          <w:rFonts w:ascii="Calibri" w:eastAsia="Times New Roman" w:hAnsi="Calibri" w:cs="Calibri"/>
+          <w:color w:val="1A1A1A"/>
+          <w:sz w:val="22"/>
+          <w:szCs w:val="22"/>
+        </w:rPr>
+      </w:pPr>
+      <w:r>
+        <w:rPr>
+          <w:rFonts w:ascii="Calibri" w:eastAsia="Times New Roman" w:hAnsi="Calibri" w:cs="Calibri"/>
+          <w:b/>
+          <w:bCs/>
+          <w:color w:val="1A1A1A"/>
+          <w:sz w:val="22"/>
+          <w:szCs w:val="22"/>
+        </w:rPr>
+        <w:t xml:space="preserve">Real GPS needs </w:t>
+      </w:r>
+      <w:r>
+        <w:rPr>
+          <w:rFonts w:ascii="Calibri" w:eastAsia="Times New Roman" w:hAnsi="Calibri" w:cs="Calibri"/>
+          <w:b/>
+          <w:bCs/>
+          <w:color w:val="1A1A1A"/>
+          <w:sz w:val="22"/>
+          <w:szCs w:val="22"/>
+        </w:rPr>
+        <w:t>a secure context.</w:t>
+      </w:r>
+      <w:r>
+        <w:rPr>
+          <w:rFonts w:ascii="Calibri" w:eastAsia="Times New Roman" w:hAnsi="Calibri" w:cs="Calibri"/>
+          <w:color w:val="1A1A1A"/>
+          <w:sz w:val="22"/>
+          <w:szCs w:val="22"/>
+        </w:rPr>
+        <w:t xml:space="preserve"> On a LAN phone use </w:t>
+      </w:r>
+      <w:r>
+        <w:rPr>
+          <w:rStyle w:val="HTMLCode"/>
+          <w:color w:val="1A1A1A"/>
+        </w:rPr>
+        <w:t>npm run dev:https</w:t>
+      </w:r>
+      <w:r>
+        <w:rPr>
+          <w:rFonts w:ascii="Calibri" w:eastAsia="Times New Roman" w:hAnsi="Calibri" w:cs="Calibri"/>
+          <w:color w:val="1A1A1A"/>
+          <w:sz w:val="22"/>
+          <w:szCs w:val="22"/>
+        </w:rPr>
+        <w:t>, but Chrome auto-denies geolocation on self-signed certs — phone GPS demos really want the deployed (HTTPS) build.</w:t>
+      </w:r>
+    </w:p>
+    <w:p>
+      <w:pPr>
+        <w:numPr>
+          <w:ilvl w:val="0"/>
+          <w:numId w:val="5"/>
+        </w:numPr>
+        <w:spacing w:before="100" w:beforeAutospacing="1" w:after="60"/>
+        <w:rPr>
+          <w:rFonts w:ascii="Calibri" w:eastAsia="Times New Roman" w:hAnsi="Calibri" w:cs="Calibri"/>
+          <w:color w:val="1A1A1A"/>
+          <w:sz w:val="22"/>
+          <w:szCs w:val="22"/>
+        </w:rPr>
+      </w:pPr>
+      <w:r>
+        <w:rPr>
+          <w:rFonts w:ascii="Calibri" w:eastAsia="Times New Roman" w:hAnsi="Calibri" w:cs="Calibri"/>
+          <w:b/>
+          <w:bCs/>
+          <w:color w:val="1A1A1A"/>
+          <w:sz w:val="22"/>
+          <w:szCs w:val="22"/>
+        </w:rPr>
         <w:t>Don't re-litigate stack choices</w:t>
       </w:r>
       <w:r>
@@ -2753,16 +2754,16 @@
           <w:sz w:val="22"/>
           <w:szCs w:val="22"/>
         </w:rPr>
-        <w:t xml:space="preserve"> (Tailwind</w:t>
-      </w:r>
-      <w:r>
-        <w:rPr>
-          <w:rFonts w:ascii="Calibri" w:eastAsia="Times New Roman" w:hAnsi="Calibri" w:cs="Calibri"/>
-          <w:color w:val="1A1A1A"/>
-          <w:sz w:val="22"/>
-          <w:szCs w:val="22"/>
-        </w:rPr>
-        <w:t xml:space="preserve"> v3, Dexie queue, barcode fallback chain, etc.) — they're fixed by the brief; see </w:t>
+        <w:t xml:space="preserve"> (Tailwind v3, Dexie queue, barcode fallback chain, etc</w:t>
+      </w:r>
+      <w:r>
+        <w:rPr>
+          <w:rFonts w:ascii="Calibri" w:eastAsia="Times New Roman" w:hAnsi="Calibri" w:cs="Calibri"/>
+          <w:color w:val="1A1A1A"/>
+          <w:sz w:val="22"/>
+          <w:szCs w:val="22"/>
+        </w:rPr>
+        <w:t xml:space="preserve">.) — they're fixed by the brief; see </w:t>
       </w:r>
       <w:r>
         <w:rPr>
@@ -2798,7 +2799,7 @@
           <w:sz w:val="22"/>
           <w:szCs w:val="22"/>
         </w:rPr>
-        <w:pict w14:anchorId="5991595D">
+        <w:pict w14:anchorId="7C70FC76">
           <v:rect id="_x0000_i1029" style="width:0;height:1.5pt" o:hralign="center" o:hrstd="t" o:hr="t" fillcolor="#a0a0a0" stroked="f"/>
         </w:pict>
       </w:r>
@@ -2842,13 +2843,7 @@
         <w:rPr>
           <w:color w:val="1A1A1A"/>
         </w:rPr>
-        <w:t>npm run build                # type-check + production b</w:t>
-      </w:r>
-      <w:r>
-        <w:rPr>
-          <w:color w:val="1A1A1A"/>
-        </w:rPr>
-        <w:t>uild — run before committing</w:t>
+        <w:t>npm run build                # type-check + production build — run before committing</w:t>
       </w:r>
     </w:p>
     <w:p>
@@ -2862,7 +2857,13 @@
         <w:rPr>
           <w:color w:val="1A1A1A"/>
         </w:rPr>
-        <w:t>npm run preview              # serve the production build (bulletproof offline test)</w:t>
+        <w:t xml:space="preserve">npm run preview  </w:t>
+      </w:r>
+      <w:r>
+        <w:rPr>
+          <w:color w:val="1A1A1A"/>
+        </w:rPr>
+        <w:t xml:space="preserve">            # serve the production build (bulletproof offline test)</w:t>
       </w:r>
     </w:p>
     <w:p>
@@ -2906,9 +2907,9 @@
 <file path=word/numbering.xml><?xml version="1.0" encoding="utf-8"?>
 <w:numbering xmlns:wpc="http://schemas.microsoft.com/office/word/2010/wordprocessingCanvas" xmlns:cx="http://schemas.microsoft.com/office/drawing/2014/chartex" xmlns:cx1="http://schemas.microsoft.com/office/drawing/2015/9/8/chartex" xmlns:cx2="http://schemas.microsoft.com/office/drawing/2015/10/21/chartex" xmlns:cx3="http://schemas.microsoft.com/office/drawing/2016/5/9/chartex" xmlns:cx4="http://schemas.microsoft.com/office/drawing/2016/5/10/chartex" xmlns:cx5="http://schemas.microsoft.com/office/drawing/2016/5/11/chartex" xmlns:cx6="http://schemas.microsoft.com/office/drawing/2016/5/12/chartex" xmlns:cx7="http://schemas.microsoft.com/office/drawing/2016/5/13/chartex" xmlns:cx8="http://schemas.microsoft.com/office/drawing/2016/5/14/chartex" xmlns:mc="http://schemas.openxmlformats.org/markup-compatibility/2006" xmlns:aink="http://schemas.microsoft.com/office/drawing/2016/ink" xmlns:am3d="http://schemas.microsoft.com/office/drawing/2017/model3d" xmlns:o="urn:schemas-microsoft-com:office:office" xmlns:r="http://schemas.openxmlformats.org/officeDocument/2006/relationships" xmlns:m="http://schemas.openxmlformats.org/officeDocument/2006/math" xmlns:v="urn:schemas-microsoft-com:vml" xmlns:wp14="http://schemas.microsoft.com/office/word/2010/wordprocessingDrawing" xmlns:wp="http://schemas.openxmlformats.org/drawingml/2006/wordprocessingDrawing" xmlns:w10="urn:schemas-microsoft-com:office:word" xmlns:w="http://schemas.openxmlformats.org/wordprocessingml/2006/main" xmlns:w14="http://schemas.microsoft.com/office/word/2010/wordml" xmlns:w15="http://schemas.microsoft.com/office/word/2012/wordml" xmlns:w16cex="http://schemas.microsoft.com/office/word/2018/wordml/cex" xmlns:w16cid="http://schemas.microsoft.com/office/word/2016/wordml/cid" xmlns:w16="http://schemas.microsoft.com/office/word/2018/wordml" xmlns:w16sdtdh="http://schemas.microsoft.com/office/word/2020/wordml/sdtdatahash" xmlns:w16se="http://schemas.microsoft.com/office/word/2015/wordml/symex" xmlns:wpg="http://schemas.microsoft.com/office/word/2010/wordprocessingGroup" xmlns:wpi="http://schemas.microsoft.com/office/word/2010/wordprocessingInk" xmlns:wne="http://schemas.microsoft.com/office/word/2006/wordml" xmlns:wps="http://schemas.microsoft.com/office/word/2010/wordprocessingShape" mc:Ignorable="w14 w15 w16se w16cid w16 w16cex w16sdtdh wp14">
   <w:abstractNum w:abstractNumId="0" w15:restartNumberingAfterBreak="0">
-    <w:nsid w:val="05220B33"/>
+    <w:nsid w:val="05CC08C3"/>
     <w:multiLevelType w:val="multilevel"/>
-    <w:tmpl w:val="A9A25570"/>
+    <w:tmpl w:val="7D660F4C"/>
     <w:lvl w:ilvl="0">
       <w:start w:val="1"/>
       <w:numFmt w:val="bullet"/>
@@ -3055,9 +3056,9 @@
     </w:lvl>
   </w:abstractNum>
   <w:abstractNum w:abstractNumId="1" w15:restartNumberingAfterBreak="0">
-    <w:nsid w:val="07271137"/>
+    <w:nsid w:val="2E08318A"/>
     <w:multiLevelType w:val="multilevel"/>
-    <w:tmpl w:val="559C99C4"/>
+    <w:tmpl w:val="6420A012"/>
     <w:lvl w:ilvl="0">
       <w:start w:val="1"/>
       <w:numFmt w:val="bullet"/>
@@ -3204,9 +3205,9 @@
     </w:lvl>
   </w:abstractNum>
   <w:abstractNum w:abstractNumId="2" w15:restartNumberingAfterBreak="0">
-    <w:nsid w:val="15FC11CC"/>
+    <w:nsid w:val="398430DD"/>
     <w:multiLevelType w:val="multilevel"/>
-    <w:tmpl w:val="FA52CE9E"/>
+    <w:tmpl w:val="7A3018A4"/>
     <w:lvl w:ilvl="0">
       <w:start w:val="1"/>
       <w:numFmt w:val="bullet"/>
@@ -3353,9 +3354,9 @@
     </w:lvl>
   </w:abstractNum>
   <w:abstractNum w:abstractNumId="3" w15:restartNumberingAfterBreak="0">
-    <w:nsid w:val="39B75F85"/>
+    <w:nsid w:val="4697567B"/>
     <w:multiLevelType w:val="multilevel"/>
-    <w:tmpl w:val="6CEE414A"/>
+    <w:tmpl w:val="F222C35C"/>
     <w:lvl w:ilvl="0">
       <w:start w:val="1"/>
       <w:numFmt w:val="bullet"/>
@@ -3501,6 +3502,119 @@
       </w:rPr>
     </w:lvl>
   </w:abstractNum>
+  <w:abstractNum w:abstractNumId="4" w15:restartNumberingAfterBreak="0">
+    <w:nsid w:val="5E2622ED"/>
+    <w:multiLevelType w:val="multilevel"/>
+    <w:tmpl w:val="1374CD60"/>
+    <w:lvl w:ilvl="0">
+      <w:start w:val="1"/>
+      <w:numFmt w:val="decimal"/>
+      <w:lvlText w:val="%1."/>
+      <w:lvlJc w:val="left"/>
+      <w:pPr>
+        <w:tabs>
+          <w:tab w:val="num" w:pos="720"/>
+        </w:tabs>
+        <w:ind w:left="720" w:hanging="360"/>
+      </w:pPr>
+    </w:lvl>
+    <w:lvl w:ilvl="1" w:tentative="1">
+      <w:start w:val="1"/>
+      <w:numFmt w:val="decimal"/>
+      <w:lvlText w:val="%2."/>
+      <w:lvlJc w:val="left"/>
+      <w:pPr>
+        <w:tabs>
+          <w:tab w:val="num" w:pos="1440"/>
+        </w:tabs>
+        <w:ind w:left="1440" w:hanging="360"/>
+      </w:pPr>
+    </w:lvl>
+    <w:lvl w:ilvl="2" w:tentative="1">
+      <w:start w:val="1"/>
+      <w:numFmt w:val="decimal"/>
+      <w:lvlText w:val="%3."/>
+      <w:lvlJc w:val="left"/>
+      <w:pPr>
+        <w:tabs>
+          <w:tab w:val="num" w:pos="2160"/>
+        </w:tabs>
+        <w:ind w:left="2160" w:hanging="360"/>
+      </w:pPr>
+    </w:lvl>
+    <w:lvl w:ilvl="3" w:tentative="1">
+      <w:start w:val="1"/>
+      <w:numFmt w:val="decimal"/>
+      <w:lvlText w:val="%4."/>
+      <w:lvlJc w:val="left"/>
+      <w:pPr>
+        <w:tabs>
+          <w:tab w:val="num" w:pos="2880"/>
+        </w:tabs>
+        <w:ind w:left="2880" w:hanging="360"/>
+      </w:pPr>
+    </w:lvl>
+    <w:lvl w:ilvl="4" w:tentative="1">
+      <w:start w:val="1"/>
+      <w:numFmt w:val="decimal"/>
+      <w:lvlText w:val="%5."/>
+      <w:lvlJc w:val="left"/>
+      <w:pPr>
+        <w:tabs>
+          <w:tab w:val="num" w:pos="3600"/>
+        </w:tabs>
+        <w:ind w:left="3600" w:hanging="360"/>
+      </w:pPr>
+    </w:lvl>
+    <w:lvl w:ilvl="5" w:tentative="1">
+      <w:start w:val="1"/>
+      <w:numFmt w:val="decimal"/>
+      <w:lvlText w:val="%6."/>
+      <w:lvlJc w:val="left"/>
+      <w:pPr>
+        <w:tabs>
+          <w:tab w:val="num" w:pos="4320"/>
+        </w:tabs>
+        <w:ind w:left="4320" w:hanging="360"/>
+      </w:pPr>
+    </w:lvl>
+    <w:lvl w:ilvl="6" w:tentative="1">
+      <w:start w:val="1"/>
+      <w:numFmt w:val="decimal"/>
+      <w:lvlText w:val="%7."/>
+      <w:lvlJc w:val="left"/>
+      <w:pPr>
+        <w:tabs>
+          <w:tab w:val="num" w:pos="5040"/>
+        </w:tabs>
+        <w:ind w:left="5040" w:hanging="360"/>
+      </w:pPr>
+    </w:lvl>
+    <w:lvl w:ilvl="7" w:tentative="1">
+      <w:start w:val="1"/>
+      <w:numFmt w:val="decimal"/>
+      <w:lvlText w:val="%8."/>
+      <w:lvlJc w:val="left"/>
+      <w:pPr>
+        <w:tabs>
+          <w:tab w:val="num" w:pos="5760"/>
+        </w:tabs>
+        <w:ind w:left="5760" w:hanging="360"/>
+      </w:pPr>
+    </w:lvl>
+    <w:lvl w:ilvl="8" w:tentative="1">
+      <w:start w:val="1"/>
+      <w:numFmt w:val="decimal"/>
+      <w:lvlText w:val="%9."/>
+      <w:lvlJc w:val="left"/>
+      <w:pPr>
+        <w:tabs>
+          <w:tab w:val="num" w:pos="6480"/>
+        </w:tabs>
+        <w:ind w:left="6480" w:hanging="360"/>
+      </w:pPr>
+    </w:lvl>
+  </w:abstractNum>
   <w:num w:numId="1">
     <w:abstractNumId w:val="0"/>
   </w:num>
@@ -3508,10 +3622,13 @@
     <w:abstractNumId w:val="1"/>
   </w:num>
   <w:num w:numId="3">
-    <w:abstractNumId w:val="3"/>
+    <w:abstractNumId w:val="2"/>
   </w:num>
   <w:num w:numId="4">
-    <w:abstractNumId w:val="2"/>
+    <w:abstractNumId w:val="4"/>
+  </w:num>
+  <w:num w:numId="5">
+    <w:abstractNumId w:val="3"/>
   </w:num>
 </w:numbering>
 </file>
@@ -4105,17 +4222,6 @@
       <w:spacing w:before="100" w:beforeAutospacing="1" w:after="100" w:afterAutospacing="1"/>
     </w:pPr>
   </w:style>
-  <w:style w:type="paragraph" w:customStyle="1" w:styleId="warn">
-    <w:name w:val="warn"/>
-    <w:basedOn w:val="Normal"/>
-    <w:pPr>
-      <w:pBdr>
-        <w:left w:val="single" w:sz="24" w:space="9" w:color="C0492F"/>
-      </w:pBdr>
-      <w:shd w:val="clear" w:color="auto" w:fill="FDF0EF"/>
-      <w:spacing w:before="100" w:beforeAutospacing="1" w:after="60"/>
-    </w:pPr>
-  </w:style>
   <w:style w:type="paragraph" w:styleId="NormalWeb">
     <w:name w:val="Normal (Web)"/>
     <w:basedOn w:val="Normal"/>

</xml_diff>